<commit_message>
Split Lab 6 extraction workflow into step tasks
</commit_message>
<xml_diff>
--- a/huong-dan-lab6-audio-spectrogram-dwt-extract.docx
+++ b/huong-dan-lab6-audio-spectrogram-dwt-extract.docx
@@ -43,7 +43,7 @@
           <w:i w:val="0"/>
           <w:sz w:val="22"/>
         </w:rPr>
-        <w:t>Lab dung hai container sender va receiver. Sender gui stego.wav va secret.key, receiver tach lai anh bi mat tu audio stego.</w:t>
+        <w:t>Lab dung hai container sender va receiver. Sender gui stego.wav va secret.key, receiver tach tin hieu tu DWT truoc, sau do dung key de khoi phuc anh.</w:t>
       </w:r>
     </w:p>
     <w:p>
@@ -223,7 +223,7 @@
           <w:i w:val="0"/>
           <w:sz w:val="22"/>
         </w:rPr>
-        <w:t>Sua extract_task.py de dien dung ten file dau vao.</w:t>
+        <w:t>Sua extract_signal_task.py de dien stego.wav va secret.key, sau do tao hidden_signal.json.</w:t>
       </w:r>
     </w:p>
     <w:p>
@@ -238,7 +238,7 @@
           <w:i w:val="0"/>
           <w:sz w:val="22"/>
         </w:rPr>
-        <w:t>Chay chuong trinh tach anh de tao recovered_secret.png.</w:t>
+        <w:t>Sua recover_image_task.py de dien hidden_signal.json va secret.key, sau do tao recovered_secret.png.</w:t>
       </w:r>
     </w:p>
     <w:p>
@@ -399,6 +399,8 @@
           <w:sz w:val="20"/>
         </w:rPr>
         <w:t>scp ~/stego/stego.wav ~/stego/secret.key ubuntu@receiver:~/stego/</w:t>
+        <w:br/>
+        <w:t>ssh ubuntu@receiver "python3 ~/stego/refresh_status.py"</w:t>
       </w:r>
     </w:p>
     <w:p>
@@ -431,7 +433,7 @@
           <w:color w:val="374151"/>
           <w:sz w:val="22"/>
         </w:rPr>
-        <w:t>Task 5: Sua extract_task.py</w:t>
+        <w:t>Task 5: Tach tin hieu bi mat tu DWT</w:t>
       </w:r>
     </w:p>
     <w:p>
@@ -449,7 +451,7 @@
         </w:rPr>
         <w:t>cd ~/stego</w:t>
         <w:br/>
-        <w:t>nano extract_task.py</w:t>
+        <w:t>nano extract_signal_task.py</w:t>
       </w:r>
     </w:p>
     <w:p>
@@ -486,6 +488,24 @@
     </w:p>
     <w:p>
       <w:pPr>
+        <w:spacing w:before="60" w:after="160" w:line="240" w:lineRule="auto"/>
+        <w:ind w:left="360" w:right="360"/>
+        <w:shd w:fill="F3F4F6"/>
+      </w:pPr>
+      <w:r>
+        <w:rPr>
+          <w:rFonts w:ascii="Consolas" w:hAnsi="Consolas" w:cs="Consolas"/>
+          <w:b w:val="0"/>
+          <w:i w:val="0"/>
+          <w:sz w:val="20"/>
+        </w:rPr>
+        <w:t>python3 extract_signal_task.py</w:t>
+        <w:br/>
+        <w:t>checkwork</w:t>
+      </w:r>
+    </w:p>
+    <w:p>
+      <w:pPr>
         <w:spacing w:before="160" w:after="80" w:line="240" w:lineRule="auto"/>
       </w:pPr>
       <w:r>
@@ -496,7 +516,7 @@
           <w:color w:val="374151"/>
           <w:sz w:val="22"/>
         </w:rPr>
-        <w:t>Task 6: Tach anh bi mat</w:t>
+        <w:t>Task 6: Dung key de khoi phuc anh</w:t>
       </w:r>
     </w:p>
     <w:p>
@@ -512,9 +532,57 @@
           <w:i w:val="0"/>
           <w:sz w:val="20"/>
         </w:rPr>
-        <w:t>python3 extract_task.py</w:t>
+        <w:t>nano recover_image_task.py</w:t>
+      </w:r>
+    </w:p>
+    <w:p>
+      <w:pPr>
+        <w:spacing w:before="0" w:after="160" w:line="276" w:lineRule="auto"/>
+      </w:pPr>
+      <w:r>
+        <w:rPr>
+          <w:rFonts w:ascii="Arial" w:hAnsi="Arial" w:cs="Arial"/>
+          <w:b w:val="0"/>
+          <w:i w:val="0"/>
+          <w:sz w:val="22"/>
+        </w:rPr>
+        <w:t>Sua hai dong TODO thanh:</w:t>
+      </w:r>
+    </w:p>
+    <w:p>
+      <w:pPr>
+        <w:spacing w:before="60" w:after="160" w:line="240" w:lineRule="auto"/>
+        <w:ind w:left="360" w:right="360"/>
+        <w:shd w:fill="F3F4F6"/>
+      </w:pPr>
+      <w:r>
+        <w:rPr>
+          <w:rFonts w:ascii="Consolas" w:hAnsi="Consolas" w:cs="Consolas"/>
+          <w:b w:val="0"/>
+          <w:i w:val="0"/>
+          <w:sz w:val="20"/>
+        </w:rPr>
+        <w:t>HIDDEN_SIGNAL = "hidden_signal.json"</w:t>
         <w:br/>
-        <w:t>ls -l recovered_secret.png</w:t>
+        <w:t>KEY_FILE = "secret.key"</w:t>
+      </w:r>
+    </w:p>
+    <w:p>
+      <w:pPr>
+        <w:spacing w:before="60" w:after="160" w:line="240" w:lineRule="auto"/>
+        <w:ind w:left="360" w:right="360"/>
+        <w:shd w:fill="F3F4F6"/>
+      </w:pPr>
+      <w:r>
+        <w:rPr>
+          <w:rFonts w:ascii="Consolas" w:hAnsi="Consolas" w:cs="Consolas"/>
+          <w:b w:val="0"/>
+          <w:i w:val="0"/>
+          <w:sz w:val="20"/>
+        </w:rPr>
+        <w:t>python3 recover_image_task.py</w:t>
+        <w:br/>
+        <w:t>checkwork</w:t>
       </w:r>
     </w:p>
     <w:p>
@@ -545,6 +613,8 @@
           <w:sz w:val="20"/>
         </w:rPr>
         <w:t>./view_recovered.sh</w:t>
+        <w:br/>
+        <w:t>checkwork</w:t>
       </w:r>
     </w:p>
     <w:p>

</xml_diff>

<commit_message>
Rename Lab 6 extraction scripts
</commit_message>
<xml_diff>
--- a/huong-dan-lab6-audio-spectrogram-dwt-extract.docx
+++ b/huong-dan-lab6-audio-spectrogram-dwt-extract.docx
@@ -223,7 +223,7 @@
           <w:i w:val="0"/>
           <w:sz w:val="22"/>
         </w:rPr>
-        <w:t>Sua extract_signal_task.py de dien stego.wav va secret.key, sau do tao hidden_signal.json.</w:t>
+        <w:t>Sua extract_signal.py de dien stego.wav va secret.key, sau do tao hidden_signal.json.</w:t>
       </w:r>
     </w:p>
     <w:p>
@@ -238,7 +238,7 @@
           <w:i w:val="0"/>
           <w:sz w:val="22"/>
         </w:rPr>
-        <w:t>Sua recover_image_task.py de dien hidden_signal.json va secret.key, sau do tao recovered_secret.png.</w:t>
+        <w:t>Sua recover_image.py de dien hidden_signal.json va secret.key, sau do tao recovered_secret.png.</w:t>
       </w:r>
     </w:p>
     <w:p>
@@ -451,7 +451,7 @@
         </w:rPr>
         <w:t>cd ~/stego</w:t>
         <w:br/>
-        <w:t>nano extract_signal_task.py</w:t>
+        <w:t>nano extract_signal.py</w:t>
       </w:r>
     </w:p>
     <w:p>
@@ -499,7 +499,7 @@
           <w:i w:val="0"/>
           <w:sz w:val="20"/>
         </w:rPr>
-        <w:t>python3 extract_signal_task.py</w:t>
+        <w:t>python3 extract_signal.py</w:t>
         <w:br/>
         <w:t>checkwork</w:t>
       </w:r>
@@ -532,7 +532,7 @@
           <w:i w:val="0"/>
           <w:sz w:val="20"/>
         </w:rPr>
-        <w:t>nano recover_image_task.py</w:t>
+        <w:t>nano recover_image.py</w:t>
       </w:r>
     </w:p>
     <w:p>
@@ -580,7 +580,7 @@
           <w:i w:val="0"/>
           <w:sz w:val="20"/>
         </w:rPr>
-        <w:t>python3 recover_image_task.py</w:t>
+        <w:t>python3 recover_image.py</w:t>
         <w:br/>
         <w:t>checkwork</w:t>
       </w:r>

</xml_diff>

<commit_message>
Update Lab 6 guide section labels
</commit_message>
<xml_diff>
--- a/huong-dan-lab6-audio-spectrogram-dwt-extract.docx
+++ b/huong-dan-lab6-audio-spectrogram-dwt-extract.docx
@@ -283,7 +283,7 @@
           <w:color w:val="374151"/>
           <w:sz w:val="22"/>
         </w:rPr>
-        <w:t>Task 1: Kiem tra sender</w:t>
+        <w:t>Phan 1: Kiem tra sender</w:t>
       </w:r>
     </w:p>
     <w:p>
@@ -318,7 +318,7 @@
           <w:color w:val="374151"/>
           <w:sz w:val="22"/>
         </w:rPr>
-        <w:t>Task 2: Bat SSH tren receiver</w:t>
+        <w:t>Phan 2: Bat SSH tren receiver</w:t>
       </w:r>
     </w:p>
     <w:p>
@@ -351,7 +351,7 @@
           <w:color w:val="374151"/>
           <w:sz w:val="22"/>
         </w:rPr>
-        <w:t>Task 3: Nghe truc tiep audio stego</w:t>
+        <w:t>Phan 3: Nghe truc tiep audio stego</w:t>
       </w:r>
     </w:p>
     <w:p>
@@ -382,7 +382,7 @@
           <w:color w:val="374151"/>
           <w:sz w:val="22"/>
         </w:rPr>
-        <w:t>Task 4: Gui file sang receiver</w:t>
+        <w:t>Phan 4: Gui file sang receiver</w:t>
       </w:r>
     </w:p>
     <w:p>
@@ -433,7 +433,7 @@
           <w:color w:val="374151"/>
           <w:sz w:val="22"/>
         </w:rPr>
-        <w:t>Task 5: Tach tin hieu bi mat tu DWT</w:t>
+        <w:t>Phan 5: Tach tin hieu bi mat tu DWT</w:t>
       </w:r>
     </w:p>
     <w:p>
@@ -516,7 +516,7 @@
           <w:color w:val="374151"/>
           <w:sz w:val="22"/>
         </w:rPr>
-        <w:t>Task 6: Dung key de khoi phuc anh</w:t>
+        <w:t>Phan 6: Dung key de khoi phuc anh</w:t>
       </w:r>
     </w:p>
     <w:p>

</xml_diff>

<commit_message>
Simplify extraction lab instructions
</commit_message>
<xml_diff>
--- a/huong-dan-lab6-audio-spectrogram-dwt-extract.docx
+++ b/huong-dan-lab6-audio-spectrogram-dwt-extract.docx
@@ -138,6 +138,20 @@
     </w:p>
     <w:p>
       <w:pPr>
+        <w:spacing w:before="0" w:after="160" w:line="276" w:lineRule="auto"/>
+      </w:pPr>
+      <w:r>
+        <w:rPr>
+          <w:rFonts w:ascii="Arial" w:hAnsi="Arial" w:cs="Arial"/>
+          <w:b w:val="0"/>
+          <w:i w:val="0"/>
+          <w:sz w:val="22"/>
+        </w:rPr>
+        <w:t>Sinh vien chi can kiem tra lenh cua tung task tao dung file dau ra. Khong can chay checkwork sau tung task; checkwork duoc chay mot lan o cuoi bai.</w:t>
+      </w:r>
+    </w:p>
+    <w:p>
+      <w:pPr>
         <w:spacing w:before="200" w:after="120" w:line="240" w:lineRule="auto"/>
       </w:pPr>
       <w:r>
@@ -268,7 +282,7 @@
           <w:i w:val="0"/>
           <w:sz w:val="22"/>
         </w:rPr>
-        <w:t>Chay checkwork de kiem tra ket qua.</w:t>
+        <w:t>Chay checkwork o cuoi bai de kiem tra ket qua.</w:t>
       </w:r>
     </w:p>
     <w:p>
@@ -501,7 +515,7 @@
         </w:rPr>
         <w:t>python3 extract_signal.py</w:t>
         <w:br/>
-        <w:t>checkwork</w:t>
+        <w:t>ls -l hidden_signal.json</w:t>
       </w:r>
     </w:p>
     <w:p>
@@ -582,7 +596,7 @@
         </w:rPr>
         <w:t>python3 recover_image.py</w:t>
         <w:br/>
-        <w:t>checkwork</w:t>
+        <w:t>ls -l recovered_secret.png</w:t>
       </w:r>
     </w:p>
     <w:p>
@@ -613,8 +627,6 @@
           <w:sz w:val="20"/>
         </w:rPr>
         <w:t>./view_recovered.sh</w:t>
-        <w:br/>
-        <w:t>checkwork</w:t>
       </w:r>
     </w:p>
     <w:p>

</xml_diff>

<commit_message>
Use empty filename placeholders in Lab 6
</commit_message>
<xml_diff>
--- a/huong-dan-lab6-audio-spectrogram-dwt-extract.docx
+++ b/huong-dan-lab6-audio-spectrogram-dwt-extract.docx
@@ -479,7 +479,7 @@
           <w:i w:val="0"/>
           <w:sz w:val="22"/>
         </w:rPr>
-        <w:t>Sua hai dong TODO thanh:</w:t>
+        <w:t>Sua hai chuoi rong thanh:</w:t>
       </w:r>
     </w:p>
     <w:p>
@@ -560,7 +560,7 @@
           <w:i w:val="0"/>
           <w:sz w:val="22"/>
         </w:rPr>
-        <w:t>Sua hai dong TODO thanh:</w:t>
+        <w:t>Sua hai chuoi rong thanh:</w:t>
       </w:r>
     </w:p>
     <w:p>

</xml_diff>

<commit_message>
Restore previous Lab 6 guide wording
</commit_message>
<xml_diff>
--- a/huong-dan-lab6-audio-spectrogram-dwt-extract.docx
+++ b/huong-dan-lab6-audio-spectrogram-dwt-extract.docx
@@ -479,7 +479,7 @@
           <w:i w:val="0"/>
           <w:sz w:val="22"/>
         </w:rPr>
-        <w:t>Sua hai chuoi rong thanh:</w:t>
+        <w:t>Sua hai dong TODO thanh:</w:t>
       </w:r>
     </w:p>
     <w:p>
@@ -560,7 +560,7 @@
           <w:i w:val="0"/>
           <w:sz w:val="22"/>
         </w:rPr>
-        <w:t>Sua hai chuoi rong thanh:</w:t>
+        <w:t>Sua hai dong TODO thanh:</w:t>
       </w:r>
     </w:p>
     <w:p>

</xml_diff>